<commit_message>
handled flow agentGraphNode  处理节点融合成sub_execute节点
</commit_message>
<xml_diff>
--- a/rag_ingest/source_docs/create_order_fail.docx
+++ b/rag_ingest/source_docs/create_order_fail.docx
@@ -21,12 +21,71 @@
     </w:p>
     <w:p>
       <w:r>
-        <w:t>查看是否获取到订单号或者traceId，有则可执行第二步；没有则通过用户名或者联系方式查询f_tts_trade_order的ttsorder</w:t>
+        <w:rPr>
+          <w:rFonts w:hint="eastAsia" w:eastAsia="宋体"/>
+          <w:lang w:val="en-US" w:eastAsia="zh-CN"/>
+        </w:rPr>
+        <w:t>查</w:t>
+      </w:r>
+      <w:r>
+        <w:t>看是否获取到订单号或者traceId，</w:t>
+      </w:r>
+      <w:r>
+        <w:rPr>
+          <w:rFonts w:hint="eastAsia" w:eastAsia="宋体"/>
+          <w:lang w:val="en-US" w:eastAsia="zh-CN"/>
+        </w:rPr>
+        <w:t>订单号例子：xep260501233827046</w:t>
+      </w:r>
+      <w:r>
+        <w:rPr>
+          <w:rFonts w:hint="default" w:eastAsia="宋体"/>
+          <w:lang w:val="en-US" w:eastAsia="zh-CN"/>
+        </w:rPr>
+        <w:t>(</w:t>
+      </w:r>
+      <w:r>
+        <w:rPr>
+          <w:rFonts w:hint="eastAsia" w:eastAsia="宋体"/>
+          <w:lang w:val="en-US" w:eastAsia="zh-CN"/>
+        </w:rPr>
+        <w:t>三个英文字母前缀加上固定位数的数字后缀可认为是订单号</w:t>
+      </w:r>
+      <w:r>
+        <w:rPr>
+          <w:rFonts w:hint="default" w:eastAsia="宋体"/>
+          <w:lang w:val="en-US" w:eastAsia="zh-CN"/>
+        </w:rPr>
+        <w:t>)</w:t>
+      </w:r>
+      <w:r>
+        <w:rPr>
+          <w:rFonts w:hint="eastAsia" w:eastAsia="宋体"/>
+          <w:lang w:val="en-US" w:eastAsia="zh-CN"/>
+        </w:rPr>
+        <w:t>，trace例子：ops_slugger_260501.233826.10.90.5.214.2196760.3144061730_1</w:t>
+      </w:r>
+      <w:r>
+        <w:rPr>
+          <w:rFonts w:hint="default" w:eastAsia="宋体"/>
+          <w:lang w:val="en-US" w:eastAsia="zh-CN"/>
+        </w:rPr>
+        <w:t xml:space="preserve"> </w:t>
+      </w:r>
+      <w:r>
+        <w:rPr>
+          <w:rFonts w:hint="eastAsia" w:eastAsia="宋体"/>
+          <w:lang w:val="en-US" w:eastAsia="zh-CN"/>
+        </w:rPr>
+        <w:t>（有前缀英文下划线拼接+多个点拼接的字符串就认为是trace）</w:t>
+      </w:r>
+      <w:r>
+        <w:t>有则可执行第二步；没有则通过用户名或者联系方式查询f_tts_trade_order的ttsorder日志，检索关键字：「生单请求参数为 {用户名/联系方式}」，从中拿</w:t>
       </w:r>
       <w:bookmarkStart w:id="0" w:name="_GoBack"/>
       <w:bookmarkEnd w:id="0"/>
       <w:r>
-        <w:t>日志，检索关键字：「生单请求参数为 {用户名/联系方式}」，从中拿到traceId后，再执行第二步。</w:t>
+        <w:t>到traceId后，再执行第二步。</w:t>
       </w:r>
     </w:p>
     <w:p>
@@ -53,7 +112,7 @@
       </w:pPr>
       <w:r>
         <w:rPr>
-          <w:rStyle w:val="138"/>
+          <w:rStyle w:val="139"/>
           <w:b/>
           <w:bCs/>
         </w:rPr>
@@ -290,7 +349,7 @@
   <w:docDefaults>
     <w:rPrDefault>
       <w:rPr>
-        <w:rFonts w:asciiTheme="minorHAnsi" w:hAnsiTheme="minorHAnsi" w:eastAsiaTheme="minorEastAsia" w:cstheme="minorBidi"/>
+        <w:rFonts w:ascii="Times New Roman" w:hAnsi="Times New Roman" w:eastAsia="宋体" w:cs="Times New Roman"/>
       </w:rPr>
     </w:rPrDefault>
     <w:pPrDefault/>
@@ -567,7 +626,7 @@
     <w:name w:val="heading 1"/>
     <w:basedOn w:val="1"/>
     <w:next w:val="1"/>
-    <w:link w:val="138"/>
+    <w:link w:val="139"/>
     <w:qFormat/>
     <w:uiPriority w:val="9"/>
     <w:pPr>
@@ -589,7 +648,7 @@
     <w:name w:val="heading 2"/>
     <w:basedOn w:val="1"/>
     <w:next w:val="1"/>
-    <w:link w:val="139"/>
+    <w:link w:val="140"/>
     <w:unhideWhenUsed/>
     <w:qFormat/>
     <w:uiPriority w:val="9"/>
@@ -617,7 +676,7 @@
     <w:name w:val="heading 3"/>
     <w:basedOn w:val="1"/>
     <w:next w:val="1"/>
-    <w:link w:val="140"/>
+    <w:link w:val="141"/>
     <w:unhideWhenUsed/>
     <w:qFormat/>
     <w:uiPriority w:val="9"/>
@@ -643,7 +702,7 @@
     <w:name w:val="heading 4"/>
     <w:basedOn w:val="1"/>
     <w:next w:val="1"/>
-    <w:link w:val="150"/>
+    <w:link w:val="151"/>
     <w:semiHidden/>
     <w:unhideWhenUsed/>
     <w:qFormat/>
@@ -672,7 +731,7 @@
     <w:name w:val="heading 5"/>
     <w:basedOn w:val="1"/>
     <w:next w:val="1"/>
-    <w:link w:val="151"/>
+    <w:link w:val="152"/>
     <w:semiHidden/>
     <w:unhideWhenUsed/>
     <w:qFormat/>
@@ -692,7 +751,7 @@
     <w:name w:val="heading 6"/>
     <w:basedOn w:val="1"/>
     <w:next w:val="1"/>
-    <w:link w:val="152"/>
+    <w:link w:val="153"/>
     <w:semiHidden/>
     <w:unhideWhenUsed/>
     <w:qFormat/>
@@ -714,7 +773,7 @@
     <w:name w:val="heading 7"/>
     <w:basedOn w:val="1"/>
     <w:next w:val="1"/>
-    <w:link w:val="153"/>
+    <w:link w:val="154"/>
     <w:semiHidden/>
     <w:unhideWhenUsed/>
     <w:qFormat/>
@@ -744,7 +803,7 @@
     <w:name w:val="heading 8"/>
     <w:basedOn w:val="1"/>
     <w:next w:val="1"/>
-    <w:link w:val="154"/>
+    <w:link w:val="155"/>
     <w:semiHidden/>
     <w:unhideWhenUsed/>
     <w:qFormat/>
@@ -771,7 +830,7 @@
     <w:name w:val="heading 9"/>
     <w:basedOn w:val="1"/>
     <w:next w:val="1"/>
-    <w:link w:val="155"/>
+    <w:link w:val="156"/>
     <w:semiHidden/>
     <w:unhideWhenUsed/>
     <w:qFormat/>
@@ -821,7 +880,7 @@
   </w:style>
   <w:style w:type="paragraph" w:styleId="2">
     <w:name w:val="macro"/>
-    <w:link w:val="147"/>
+    <w:link w:val="148"/>
     <w:unhideWhenUsed/>
     <w:uiPriority w:val="99"/>
     <w:pPr>
@@ -919,7 +978,7 @@
   <w:style w:type="paragraph" w:styleId="17">
     <w:name w:val="Body Text 3"/>
     <w:basedOn w:val="1"/>
-    <w:link w:val="146"/>
+    <w:link w:val="147"/>
     <w:unhideWhenUsed/>
     <w:uiPriority w:val="99"/>
     <w:pPr>
@@ -946,7 +1005,7 @@
   <w:style w:type="paragraph" w:styleId="19">
     <w:name w:val="Body Text"/>
     <w:basedOn w:val="1"/>
-    <w:link w:val="144"/>
+    <w:link w:val="145"/>
     <w:unhideWhenUsed/>
     <w:uiPriority w:val="99"/>
     <w:pPr>
@@ -1003,6 +1062,20 @@
   <w:style w:type="paragraph" w:styleId="24">
     <w:name w:val="footer"/>
     <w:basedOn w:val="1"/>
+    <w:link w:val="137"/>
+    <w:unhideWhenUsed/>
+    <w:uiPriority w:val="99"/>
+    <w:pPr>
+      <w:tabs>
+        <w:tab w:val="center" w:pos="4680"/>
+        <w:tab w:val="right" w:pos="9360"/>
+      </w:tabs>
+      <w:spacing w:after="0" w:line="240" w:lineRule="auto"/>
+    </w:pPr>
+  </w:style>
+  <w:style w:type="paragraph" w:styleId="25">
+    <w:name w:val="header"/>
+    <w:basedOn w:val="1"/>
     <w:link w:val="136"/>
     <w:unhideWhenUsed/>
     <w:uiPriority w:val="99"/>
@@ -1014,25 +1087,11 @@
       <w:spacing w:after="0" w:line="240" w:lineRule="auto"/>
     </w:pPr>
   </w:style>
-  <w:style w:type="paragraph" w:styleId="25">
-    <w:name w:val="header"/>
-    <w:basedOn w:val="1"/>
-    <w:link w:val="135"/>
-    <w:unhideWhenUsed/>
-    <w:uiPriority w:val="99"/>
-    <w:pPr>
-      <w:tabs>
-        <w:tab w:val="center" w:pos="4680"/>
-        <w:tab w:val="right" w:pos="9360"/>
-      </w:tabs>
-      <w:spacing w:after="0" w:line="240" w:lineRule="auto"/>
-    </w:pPr>
-  </w:style>
   <w:style w:type="paragraph" w:styleId="26">
     <w:name w:val="Subtitle"/>
     <w:basedOn w:val="1"/>
     <w:next w:val="1"/>
-    <w:link w:val="142"/>
+    <w:link w:val="143"/>
     <w:qFormat/>
     <w:uiPriority w:val="11"/>
     <w:rPr>
@@ -1063,7 +1122,7 @@
   <w:style w:type="paragraph" w:styleId="28">
     <w:name w:val="Body Text 2"/>
     <w:basedOn w:val="1"/>
-    <w:link w:val="145"/>
+    <w:link w:val="146"/>
     <w:unhideWhenUsed/>
     <w:uiPriority w:val="99"/>
     <w:pPr>
@@ -1096,7 +1155,7 @@
     <w:name w:val="Title"/>
     <w:basedOn w:val="1"/>
     <w:next w:val="1"/>
-    <w:link w:val="141"/>
+    <w:link w:val="142"/>
     <w:qFormat/>
     <w:uiPriority w:val="10"/>
     <w:pPr>
@@ -12563,19 +12622,30 @@
       <w:iCs/>
     </w:rPr>
   </w:style>
-  <w:style w:type="character" w:customStyle="1" w:styleId="135">
+  <w:style w:type="character" w:styleId="135">
+    <w:name w:val="Hyperlink"/>
+    <w:basedOn w:val="132"/>
+    <w:semiHidden/>
+    <w:unhideWhenUsed/>
+    <w:uiPriority w:val="99"/>
+    <w:rPr>
+      <w:color w:val="0000FF"/>
+      <w:u w:val="single"/>
+    </w:rPr>
+  </w:style>
+  <w:style w:type="character" w:customStyle="1" w:styleId="136">
     <w:name w:val="Header Char"/>
     <w:basedOn w:val="132"/>
     <w:link w:val="25"/>
     <w:uiPriority w:val="99"/>
   </w:style>
-  <w:style w:type="character" w:customStyle="1" w:styleId="136">
+  <w:style w:type="character" w:customStyle="1" w:styleId="137">
     <w:name w:val="Footer Char"/>
     <w:basedOn w:val="132"/>
     <w:link w:val="24"/>
     <w:uiPriority w:val="99"/>
   </w:style>
-  <w:style w:type="paragraph" w:styleId="137">
+  <w:style w:type="paragraph" w:styleId="138">
     <w:name w:val="No Spacing"/>
     <w:qFormat/>
     <w:uiPriority w:val="1"/>
@@ -12589,7 +12659,7 @@
       <w:lang w:val="en-US" w:eastAsia="en-US" w:bidi="ar-SA"/>
     </w:rPr>
   </w:style>
-  <w:style w:type="character" w:customStyle="1" w:styleId="138">
+  <w:style w:type="character" w:customStyle="1" w:styleId="139">
     <w:name w:val="Heading 1 Char"/>
     <w:basedOn w:val="132"/>
     <w:link w:val="3"/>
@@ -12603,7 +12673,7 @@
       <w:szCs w:val="28"/>
     </w:rPr>
   </w:style>
-  <w:style w:type="character" w:customStyle="1" w:styleId="139">
+  <w:style w:type="character" w:customStyle="1" w:styleId="140">
     <w:name w:val="Heading 2 Char"/>
     <w:basedOn w:val="132"/>
     <w:link w:val="4"/>
@@ -12622,7 +12692,7 @@
       </w14:textFill>
     </w:rPr>
   </w:style>
-  <w:style w:type="character" w:customStyle="1" w:styleId="140">
+  <w:style w:type="character" w:customStyle="1" w:styleId="141">
     <w:name w:val="Heading 3 Char"/>
     <w:basedOn w:val="132"/>
     <w:link w:val="5"/>
@@ -12639,7 +12709,7 @@
       </w14:textFill>
     </w:rPr>
   </w:style>
-  <w:style w:type="character" w:customStyle="1" w:styleId="141">
+  <w:style w:type="character" w:customStyle="1" w:styleId="142">
     <w:name w:val="Title Char"/>
     <w:basedOn w:val="132"/>
     <w:link w:val="31"/>
@@ -12653,7 +12723,7 @@
       <w:szCs w:val="52"/>
     </w:rPr>
   </w:style>
-  <w:style w:type="character" w:customStyle="1" w:styleId="142">
+  <w:style w:type="character" w:customStyle="1" w:styleId="143">
     <w:name w:val="Subtitle Char"/>
     <w:basedOn w:val="132"/>
     <w:link w:val="26"/>
@@ -12673,7 +12743,7 @@
       </w14:textFill>
     </w:rPr>
   </w:style>
-  <w:style w:type="paragraph" w:styleId="143">
+  <w:style w:type="paragraph" w:styleId="144">
     <w:name w:val="List Paragraph"/>
     <w:basedOn w:val="1"/>
     <w:qFormat/>
@@ -12683,19 +12753,19 @@
       <w:contextualSpacing/>
     </w:pPr>
   </w:style>
-  <w:style w:type="character" w:customStyle="1" w:styleId="144">
+  <w:style w:type="character" w:customStyle="1" w:styleId="145">
     <w:name w:val="Body Text Char"/>
     <w:basedOn w:val="132"/>
     <w:link w:val="19"/>
     <w:uiPriority w:val="99"/>
   </w:style>
-  <w:style w:type="character" w:customStyle="1" w:styleId="145">
+  <w:style w:type="character" w:customStyle="1" w:styleId="146">
     <w:name w:val="Body Text 2 Char"/>
     <w:basedOn w:val="132"/>
     <w:link w:val="28"/>
     <w:uiPriority w:val="99"/>
   </w:style>
-  <w:style w:type="character" w:customStyle="1" w:styleId="146">
+  <w:style w:type="character" w:customStyle="1" w:styleId="147">
     <w:name w:val="Body Text 3 Char"/>
     <w:basedOn w:val="132"/>
     <w:link w:val="17"/>
@@ -12705,7 +12775,7 @@
       <w:szCs w:val="16"/>
     </w:rPr>
   </w:style>
-  <w:style w:type="character" w:customStyle="1" w:styleId="147">
+  <w:style w:type="character" w:customStyle="1" w:styleId="148">
     <w:name w:val="Macro Text Char"/>
     <w:basedOn w:val="132"/>
     <w:link w:val="2"/>
@@ -12716,11 +12786,11 @@
       <w:szCs w:val="20"/>
     </w:rPr>
   </w:style>
-  <w:style w:type="paragraph" w:styleId="148">
+  <w:style w:type="paragraph" w:styleId="149">
     <w:name w:val="Quote"/>
     <w:basedOn w:val="1"/>
     <w:next w:val="1"/>
-    <w:link w:val="149"/>
+    <w:link w:val="150"/>
     <w:qFormat/>
     <w:uiPriority w:val="29"/>
     <w:rPr>
@@ -12734,10 +12804,10 @@
       </w14:textFill>
     </w:rPr>
   </w:style>
-  <w:style w:type="character" w:customStyle="1" w:styleId="149">
+  <w:style w:type="character" w:customStyle="1" w:styleId="150">
     <w:name w:val="Quote Char"/>
     <w:basedOn w:val="132"/>
-    <w:link w:val="148"/>
+    <w:link w:val="149"/>
     <w:uiPriority w:val="29"/>
     <w:rPr>
       <w:i/>
@@ -12750,7 +12820,7 @@
       </w14:textFill>
     </w:rPr>
   </w:style>
-  <w:style w:type="character" w:customStyle="1" w:styleId="150">
+  <w:style w:type="character" w:customStyle="1" w:styleId="151">
     <w:name w:val="Heading 4 Char"/>
     <w:basedOn w:val="132"/>
     <w:link w:val="6"/>
@@ -12770,7 +12840,7 @@
       </w14:textFill>
     </w:rPr>
   </w:style>
-  <w:style w:type="character" w:customStyle="1" w:styleId="151">
+  <w:style w:type="character" w:customStyle="1" w:styleId="152">
     <w:name w:val="Heading 5 Char"/>
     <w:basedOn w:val="132"/>
     <w:link w:val="7"/>
@@ -12781,7 +12851,7 @@
       <w:color w:val="254061" w:themeColor="accent1" w:themeShade="80"/>
     </w:rPr>
   </w:style>
-  <w:style w:type="character" w:customStyle="1" w:styleId="152">
+  <w:style w:type="character" w:customStyle="1" w:styleId="153">
     <w:name w:val="Heading 6 Char"/>
     <w:basedOn w:val="132"/>
     <w:link w:val="8"/>
@@ -12794,7 +12864,7 @@
       <w:color w:val="254061" w:themeColor="accent1" w:themeShade="80"/>
     </w:rPr>
   </w:style>
-  <w:style w:type="character" w:customStyle="1" w:styleId="153">
+  <w:style w:type="character" w:customStyle="1" w:styleId="154">
     <w:name w:val="Heading 7 Char"/>
     <w:basedOn w:val="132"/>
     <w:link w:val="9"/>
@@ -12815,7 +12885,7 @@
       </w14:textFill>
     </w:rPr>
   </w:style>
-  <w:style w:type="character" w:customStyle="1" w:styleId="154">
+  <w:style w:type="character" w:customStyle="1" w:styleId="155">
     <w:name w:val="Heading 8 Char"/>
     <w:basedOn w:val="132"/>
     <w:link w:val="10"/>
@@ -12833,7 +12903,7 @@
       </w14:textFill>
     </w:rPr>
   </w:style>
-  <w:style w:type="character" w:customStyle="1" w:styleId="155">
+  <w:style w:type="character" w:customStyle="1" w:styleId="156">
     <w:name w:val="Heading 9 Char"/>
     <w:basedOn w:val="132"/>
     <w:link w:val="11"/>
@@ -12856,11 +12926,11 @@
       </w14:textFill>
     </w:rPr>
   </w:style>
-  <w:style w:type="paragraph" w:styleId="156">
+  <w:style w:type="paragraph" w:styleId="157">
     <w:name w:val="Intense Quote"/>
     <w:basedOn w:val="1"/>
     <w:next w:val="1"/>
-    <w:link w:val="157"/>
+    <w:link w:val="158"/>
     <w:qFormat/>
     <w:uiPriority w:val="30"/>
     <w:pPr>
@@ -12883,10 +12953,10 @@
       </w14:textFill>
     </w:rPr>
   </w:style>
-  <w:style w:type="character" w:customStyle="1" w:styleId="157">
+  <w:style w:type="character" w:customStyle="1" w:styleId="158">
     <w:name w:val="Intense Quote Char"/>
     <w:basedOn w:val="132"/>
-    <w:link w:val="156"/>
+    <w:link w:val="157"/>
     <w:uiPriority w:val="30"/>
     <w:rPr>
       <w:b/>
@@ -12901,7 +12971,7 @@
       </w14:textFill>
     </w:rPr>
   </w:style>
-  <w:style w:type="character" w:customStyle="1" w:styleId="158">
+  <w:style w:type="character" w:customStyle="1" w:styleId="159">
     <w:name w:val="Subtle Emphasis"/>
     <w:basedOn w:val="132"/>
     <w:qFormat/>
@@ -12920,7 +12990,7 @@
       </w14:textFill>
     </w:rPr>
   </w:style>
-  <w:style w:type="character" w:customStyle="1" w:styleId="159">
+  <w:style w:type="character" w:customStyle="1" w:styleId="160">
     <w:name w:val="Intense Emphasis"/>
     <w:basedOn w:val="132"/>
     <w:qFormat/>
@@ -12938,7 +13008,7 @@
       </w14:textFill>
     </w:rPr>
   </w:style>
-  <w:style w:type="character" w:customStyle="1" w:styleId="160">
+  <w:style w:type="character" w:customStyle="1" w:styleId="161">
     <w:name w:val="Subtle Reference"/>
     <w:basedOn w:val="132"/>
     <w:qFormat/>
@@ -12954,7 +13024,7 @@
       </w14:textFill>
     </w:rPr>
   </w:style>
-  <w:style w:type="character" w:customStyle="1" w:styleId="161">
+  <w:style w:type="character" w:customStyle="1" w:styleId="162">
     <w:name w:val="Intense Reference"/>
     <w:basedOn w:val="132"/>
     <w:qFormat/>
@@ -12973,7 +13043,7 @@
       </w14:textFill>
     </w:rPr>
   </w:style>
-  <w:style w:type="character" w:customStyle="1" w:styleId="162">
+  <w:style w:type="character" w:customStyle="1" w:styleId="163">
     <w:name w:val="Book Title"/>
     <w:basedOn w:val="132"/>
     <w:qFormat/>
@@ -12985,7 +13055,7 @@
       <w:spacing w:val="5"/>
     </w:rPr>
   </w:style>
-  <w:style w:type="paragraph" w:customStyle="1" w:styleId="163">
+  <w:style w:type="paragraph" w:customStyle="1" w:styleId="164">
     <w:name w:val="TOC Heading"/>
     <w:basedOn w:val="3"/>
     <w:next w:val="1"/>

</xml_diff>